<commit_message>
Publish to GitHub Pages and document both live URLs
- vite base is now configurable (VITE_BASE) so the same source builds for a
  domain root (Vercel) and a sub-path (GitHub Pages)
- tools/deploy_pages.py builds with the /datalens/ base, writes .nojekyll and a
  404.html fallback, pushes gh-pages and configures Pages
- READMEs and the highlights document list both URLs and the repository
- audit tools accept PLAYWRIGHT_NO_PROXY=1 to run against deployed sites from a
  machine whose system proxy is unreachable
</commit_message>
<xml_diff>
--- a/deliverables/DataLens-亮点说明.docx
+++ b/deliverables/DataLens-亮点说明.docx
@@ -41,6 +41,20 @@
           <w:u w:val="single"/>
         </w:rPr>
         <w:t>https://datalens-steel-iota.vercel.app</w:t>
+      </w:r>
+    </w:p>
+    <w:p>
+      <w:pPr>
+        <w:jc w:val="center"/>
+      </w:pPr>
+      <w:r>
+        <w:rPr>
+          <w:rFonts w:ascii="Microsoft YaHei" w:hAnsi="Microsoft YaHei" w:eastAsia="Microsoft YaHei"/>
+          <w:color w:val="4B41D6"/>
+          <w:sz w:val="20"/>
+          <w:u w:val="single"/>
+        </w:rPr>
+        <w:t>https://wangling1206.github.io/datalens/</w:t>
       </w:r>
     </w:p>
     <w:p/>
@@ -2403,7 +2417,71 @@
                 <w:rFonts w:ascii="Microsoft YaHei" w:hAnsi="Microsoft YaHei" w:eastAsia="Microsoft YaHei"/>
                 <w:sz w:val="18"/>
               </w:rPr>
-              <w:t>https://datalens-steel-iota.vercel.app</w:t>
+              <w:t>https://datalens-steel-iota.vercel.app（Vercel）</w:t>
+            </w:r>
+          </w:p>
+        </w:tc>
+      </w:tr>
+      <w:tr>
+        <w:tc>
+          <w:tcPr>
+            <w:tcW w:type="dxa" w:w="4824"/>
+          </w:tcPr>
+          <w:p>
+            <w:r/>
+            <w:r>
+              <w:rPr>
+                <w:rFonts w:ascii="Microsoft YaHei" w:hAnsi="Microsoft YaHei" w:eastAsia="Microsoft YaHei"/>
+                <w:sz w:val="18"/>
+              </w:rPr>
+              <w:t>在线地址（镜像）/ Live URL (mirror)</w:t>
+            </w:r>
+          </w:p>
+        </w:tc>
+        <w:tc>
+          <w:tcPr>
+            <w:tcW w:type="dxa" w:w="4824"/>
+          </w:tcPr>
+          <w:p>
+            <w:r/>
+            <w:r>
+              <w:rPr>
+                <w:rFonts w:ascii="Microsoft YaHei" w:hAnsi="Microsoft YaHei" w:eastAsia="Microsoft YaHei"/>
+                <w:sz w:val="18"/>
+              </w:rPr>
+              <w:t>https://wangling1206.github.io/datalens/（GitHub Pages，同一份构建）</w:t>
+            </w:r>
+          </w:p>
+        </w:tc>
+      </w:tr>
+      <w:tr>
+        <w:tc>
+          <w:tcPr>
+            <w:tcW w:type="dxa" w:w="4824"/>
+          </w:tcPr>
+          <w:p>
+            <w:r/>
+            <w:r>
+              <w:rPr>
+                <w:rFonts w:ascii="Microsoft YaHei" w:hAnsi="Microsoft YaHei" w:eastAsia="Microsoft YaHei"/>
+                <w:sz w:val="18"/>
+              </w:rPr>
+              <w:t>源码仓库 / Repository</w:t>
+            </w:r>
+          </w:p>
+        </w:tc>
+        <w:tc>
+          <w:tcPr>
+            <w:tcW w:type="dxa" w:w="4824"/>
+          </w:tcPr>
+          <w:p>
+            <w:r/>
+            <w:r>
+              <w:rPr>
+                <w:rFonts w:ascii="Microsoft YaHei" w:hAnsi="Microsoft YaHei" w:eastAsia="Microsoft YaHei"/>
+                <w:sz w:val="18"/>
+              </w:rPr>
+              <w:t>https://github.com/WangLing1206/datalens</w:t>
             </w:r>
           </w:p>
         </w:tc>
@@ -2523,7 +2601,7 @@
           <w:rFonts w:ascii="Microsoft YaHei" w:hAnsi="Microsoft YaHei" w:eastAsia="Microsoft YaHei"/>
           <w:sz w:val="21"/>
         </w:rPr>
-        <w:t>运行方式：npm install 安装依赖，npm run dev 启动开发服务器（localhost:5173），npm run build 生产构建，npm test 运行全部单元测试，npm run e2e 在真实浏览器里跑端到端测试。部署方面，项目已配置好 vercel.json，执行 npx vercel --prod 即可发布；也可以把 dist/ 目录部署到任意静态托管。</w:t>
+        <w:t>运行方式：npm install 安装依赖，npm run dev 启动开发服务器（localhost:5173），npm run build 生产构建，npm test 运行全部单元测试，npm run e2e 在真实浏览器里跑端到端测试。部署方面，项目已配置好 vercel.json，执行 npx vercel --prod 即可发布；GitHub Pages 的发布用 python tools/deploy_pages.py（自动以 /datalens/ 为 base 构建并推送到 gh-pages 分支）；也可以把 dist/ 目录部署到任意静态托管。</w:t>
       </w:r>
     </w:p>
     <w:p>
@@ -2538,7 +2616,7 @@
           <w:color w:val="6B7286"/>
           <w:sz w:val="19"/>
         </w:rPr>
-        <w:t>To run: npm install, then npm run dev for the dev server (localhost:5173), npm run build for a production build, npm test for the unit suite, and npm run e2e to drive the real app in a browser. For deployment, vercel.json is already configured — run npx vercel --prod, or serve the dist/ directory from any static host.</w:t>
+        <w:t>To run: npm install, then npm run dev for the dev server (localhost:5173), npm run build for a production build, npm test for the unit suite, and npm run e2e to drive the real app in a browser. For deployment, vercel.json is already configured — run npx vercel --prod. For GitHub Pages, python tools/deploy_pages.py builds with the /datalens/ base and pushes the result to the gh-pages branch. Any static host will also do.</w:t>
       </w:r>
     </w:p>
     <w:p>

</xml_diff>